<commit_message>
Staff password: Muna1234D for suborna@iubat.edu (idempotent SeedData update + docx)
</commit_message>
<xml_diff>
--- a/IUBAT_Student_Service_Request_System_Report.docx
+++ b/IUBAT_Student_Service_Request_System_Report.docx
@@ -3484,7 +3484,7 @@
                 <w:color w:val="1D2327"/>
                 <w:sz w:val="16"/>
               </w:rPr>
-              <w:t>Staff login (seeded, not self-register) — suborna@iubat.edu / P@ssW0rd</w:t>
+              <w:t>Staff login (seeded, not self-register) — suborna@iubat.edu / Muna1234D</w:t>
             </w:r>
           </w:p>
         </w:tc>
@@ -4515,7 +4515,7 @@
           <w:rFonts w:ascii="Calibri" w:hAnsi="Calibri"/>
           <w:sz w:val="20"/>
         </w:rPr>
-        <w:t>Seeded staff (SeedData.InitializeAsync) creates Student/Staff roles and a single staff account (suborna@iubat.edu / P@ssW0rd) — university retains control, no public staff self-registration.</w:t>
+        <w:t>Seeded staff (SeedData.InitializeAsync) creates Student/Staff roles and a single staff account (suborna@iubat.edu / Muna1234D) — university retains control, no public staff self-registration.</w:t>
       </w:r>
     </w:p>
     <w:p>
@@ -7756,7 +7756,7 @@
           <w:i/>
           <w:sz w:val="18"/>
         </w:rPr>
-        <w:t>ApplicationDbContext : IdentityDbContext&lt;ApplicationUser&gt; exposes DbSet&lt;ServiceRequest&gt; with Fluent config HasOne(Student).WithMany().HasForeignKey(StudentId).OnDelete(Restrict). SeedData.InitializeAsync creates roles Student/Staff and a staff user (suborna@iubat.edu / P@ssW0rd) idempotently — the only staff account; students self-register as Student only.</w:t>
+        <w:t>ApplicationDbContext : IdentityDbContext&lt;ApplicationUser&gt; exposes DbSet&lt;ServiceRequest&gt; with Fluent config HasOne(Student).WithMany().HasForeignKey(StudentId).OnDelete(Restrict). SeedData.InitializeAsync creates roles Student/Staff and a staff user (suborna@iubat.edu / Muna1234D) idempotently — the only staff account; students self-register as Student only.</w:t>
       </w:r>
     </w:p>
     <w:p>
@@ -7827,7 +7827,7 @@
               <w:br/>
               <w:t xml:space="preserve">    };</w:t>
               <w:br/>
-              <w:t xml:space="preserve">    var result = await userManager.CreateAsync(staffUser, "P@ssW0rd");</w:t>
+              <w:t xml:space="preserve">    var result = await userManager.CreateAsync(staffUser, "Muna1234D");</w:t>
               <w:br/>
               <w:t xml:space="preserve">    if (result.Succeeded) await userManager.AddToRoleAsync(staffUser, "Staff");</w:t>
               <w:br/>
@@ -8645,7 +8645,7 @@
           <w:rFonts w:ascii="Calibri" w:hAnsi="Calibri"/>
           <w:sz w:val="20"/>
         </w:rPr>
-        <w:t>Password policy: RequireDigit + RequireUppercase + RequiredLength 6, RequireLowercase=false (so P@ssW0rd for suborna@iubat.edu passes), RequireNonAlphanumeric=false (Program.cs).</w:t>
+        <w:t>Password policy: RequireDigit + RequireUppercase + RequiredLength 6, RequireLowercase=false (so Muna1234D for suborna@iubat.edu passes), RequireNonAlphanumeric=false (Program.cs).</w:t>
       </w:r>
     </w:p>
     <w:p>
@@ -9339,7 +9339,7 @@
           <w:rFonts w:ascii="Calibri" w:hAnsi="Calibri"/>
           <w:sz w:val="20"/>
         </w:rPr>
-        <w:t>A single-aggregate MVC app where students register, submit (type + description), and track via MyRequests/Details, and staff (seeded as suborna@iubat.edu / P@ssW0rd) view all requests and atomically update status (Pending→Processing→Completed/Rejected) with timestamps — all behind [Authorize] and StudentId-scoped queries. SMUCT theme (navy #0E043A / pale-blue #E8F4FF) distinguishes the portal while preserving MVC logic.</w:t>
+        <w:t>A single-aggregate MVC app where students register, submit (type + description), and track via MyRequests/Details, and staff (seeded as suborna@iubat.edu / Muna1234D) view all requests and atomically update status (Pending→Processing→Completed/Rejected) with timestamps — all behind [Authorize] and StudentId-scoped queries. SMUCT theme (navy #0E043A / pale-blue #E8F4FF) distinguishes the portal while preserving MVC logic.</w:t>
       </w:r>
     </w:p>
     <w:p>

</xml_diff>